<commit_message>
Update of DES Confirmation handling
</commit_message>
<xml_diff>
--- a/CUWebinars.Web/App_Data/mergeTemplates/OrderSubmittedDES.docx
+++ b/CUWebinars.Web/App_Data/mergeTemplates/OrderSubmittedDES.docx
@@ -1,6 +1,6 @@
 
 <file path=word/document.xml><?xml version="1.0" encoding="utf-8"?>
-<w:document xmlns:wpc="http://schemas.microsoft.com/office/word/2010/wordprocessingCanvas" xmlns:cx="http://schemas.microsoft.com/office/drawing/2014/chartex" xmlns:cx1="http://schemas.microsoft.com/office/drawing/2015/9/8/chartex" xmlns:cx2="http://schemas.microsoft.com/office/drawing/2015/10/21/chartex" xmlns:cx3="http://schemas.microsoft.com/office/drawing/2016/5/9/chartex" xmlns:cx4="http://schemas.microsoft.com/office/drawing/2016/5/10/chartex" xmlns:cx5="http://schemas.microsoft.com/office/drawing/2016/5/11/chartex" xmlns:mc="http://schemas.openxmlformats.org/markup-compatibility/2006" xmlns:o="urn:schemas-microsoft-com:office:office" xmlns:r="http://schemas.openxmlformats.org/officeDocument/2006/relationships" xmlns:m="http://schemas.openxmlformats.org/officeDocument/2006/math" xmlns:v="urn:schemas-microsoft-com:vml" xmlns:wp14="http://schemas.microsoft.com/office/word/2010/wordprocessingDrawing" xmlns:wp="http://schemas.openxmlformats.org/drawingml/2006/wordprocessingDrawing" xmlns:w10="urn:schemas-microsoft-com:office:word" xmlns:w="http://schemas.openxmlformats.org/wordprocessingml/2006/main" xmlns:w14="http://schemas.microsoft.com/office/word/2010/wordml" xmlns:w15="http://schemas.microsoft.com/office/word/2012/wordml" xmlns:w16se="http://schemas.microsoft.com/office/word/2015/wordml/symex" xmlns:wpg="http://schemas.microsoft.com/office/word/2010/wordprocessingGroup" xmlns:wpi="http://schemas.microsoft.com/office/word/2010/wordprocessingInk" xmlns:wne="http://schemas.microsoft.com/office/word/2006/wordml" xmlns:wps="http://schemas.microsoft.com/office/word/2010/wordprocessingShape" mc:Ignorable="w14 w15 w16se wp14">
+<w:document xmlns:wpc="http://schemas.microsoft.com/office/word/2010/wordprocessingCanvas" xmlns:cx="http://schemas.microsoft.com/office/drawing/2014/chartex" xmlns:cx1="http://schemas.microsoft.com/office/drawing/2015/9/8/chartex" xmlns:cx2="http://schemas.microsoft.com/office/drawing/2015/10/21/chartex" xmlns:cx3="http://schemas.microsoft.com/office/drawing/2016/5/9/chartex" xmlns:cx4="http://schemas.microsoft.com/office/drawing/2016/5/10/chartex" xmlns:cx5="http://schemas.microsoft.com/office/drawing/2016/5/11/chartex" xmlns:cx6="http://schemas.microsoft.com/office/drawing/2016/5/12/chartex" xmlns:cx7="http://schemas.microsoft.com/office/drawing/2016/5/13/chartex" xmlns:cx8="http://schemas.microsoft.com/office/drawing/2016/5/14/chartex" xmlns:mc="http://schemas.openxmlformats.org/markup-compatibility/2006" xmlns:aink="http://schemas.microsoft.com/office/drawing/2016/ink" xmlns:am3d="http://schemas.microsoft.com/office/drawing/2017/model3d" xmlns:o="urn:schemas-microsoft-com:office:office" xmlns:r="http://schemas.openxmlformats.org/officeDocument/2006/relationships" xmlns:m="http://schemas.openxmlformats.org/officeDocument/2006/math" xmlns:v="urn:schemas-microsoft-com:vml" xmlns:wp14="http://schemas.microsoft.com/office/word/2010/wordprocessingDrawing" xmlns:wp="http://schemas.openxmlformats.org/drawingml/2006/wordprocessingDrawing" xmlns:w10="urn:schemas-microsoft-com:office:word" xmlns:w="http://schemas.openxmlformats.org/wordprocessingml/2006/main" xmlns:w14="http://schemas.microsoft.com/office/word/2010/wordml" xmlns:w15="http://schemas.microsoft.com/office/word/2012/wordml" xmlns:w16cid="http://schemas.microsoft.com/office/word/2016/wordml/cid" xmlns:w16se="http://schemas.microsoft.com/office/word/2015/wordml/symex" xmlns:wpg="http://schemas.microsoft.com/office/word/2010/wordprocessingGroup" xmlns:wpi="http://schemas.microsoft.com/office/word/2010/wordprocessingInk" xmlns:wne="http://schemas.microsoft.com/office/word/2006/wordml" xmlns:wps="http://schemas.microsoft.com/office/word/2010/wordprocessingShape" mc:Ignorable="w14 w15 w16se w16cid wp14">
   <w:body>
     <w:tbl>
       <w:tblPr>
@@ -335,27 +335,14 @@
             <w:r>
               <w:t xml:space="preserve">Dear </w:t>
             </w:r>
-            <w:r>
-              <w:fldChar w:fldCharType="begin"/>
-            </w:r>
-            <w:r>
-              <w:instrText xml:space="preserve"> MERGEFIELD  FirstName  \* MERGEFORMAT </w:instrText>
-            </w:r>
-            <w:r>
-              <w:fldChar w:fldCharType="separate"/>
-            </w:r>
-            <w:r>
-              <w:rPr>
-                <w:noProof/>
-              </w:rPr>
-              <w:t>«FirstName»</w:t>
-            </w:r>
-            <w:r>
-              <w:rPr>
-                <w:noProof/>
-              </w:rPr>
-              <w:fldChar w:fldCharType="end"/>
-            </w:r>
+            <w:fldSimple w:instr=" MERGEFIELD  FirstName  \* MERGEFORMAT ">
+              <w:r>
+                <w:rPr>
+                  <w:noProof/>
+                </w:rPr>
+                <w:t>«FirstName»</w:t>
+              </w:r>
+            </w:fldSimple>
             <w:r>
               <w:t>,</w:t>
             </w:r>
@@ -365,8 +352,47 @@
               <w:spacing w:before="200"/>
             </w:pPr>
             <w:r>
-              <w:t>Thank you for your order!</w:t>
+              <w:t>Hello,</w:t>
             </w:r>
+          </w:p>
+          <w:p>
+            <w:pPr>
+              <w:spacing w:before="200"/>
+            </w:pPr>
+            <w:r>
+              <w:t>Thank you for subscribing to the Directors Education Series. Your order has been entered in our system and your general registration information is included below for your review.  </w:t>
+            </w:r>
+          </w:p>
+          <w:p>
+            <w:pPr>
+              <w:spacing w:before="200"/>
+              <w:rPr>
+                <w:noProof/>
+              </w:rPr>
+            </w:pPr>
+            <w:fldSimple w:instr=" MERGEFIELD  RegDesc  \* MERGEFORMAT ">
+              <w:r>
+                <w:rPr>
+                  <w:noProof/>
+                </w:rPr>
+                <w:t>«RegDesc»</w:t>
+              </w:r>
+            </w:fldSimple>
+            <w:bookmarkStart w:id="0" w:name="_GoBack"/>
+            <w:bookmarkEnd w:id="0"/>
+          </w:p>
+          <w:p>
+            <w:pPr>
+              <w:spacing w:before="200"/>
+            </w:pPr>
+            <w:r>
+              <w:t>A Directors Education Series representative will contact you shortly with your account and group information. </w:t>
+            </w:r>
+          </w:p>
+          <w:p>
+            <w:pPr>
+              <w:spacing w:before="200"/>
+            </w:pPr>
           </w:p>
           <w:p>
             <w:pPr>
@@ -377,7 +403,7 @@
               </w:rPr>
             </w:pPr>
             <w:r>
-              <w:t>What’s next?</w:t>
+              <w:t>If you have any questions or do not hear from a representative, please email info@ttsTrain.com or call 800-831-0678.</w:t>
             </w:r>
             <w:r>
               <w:br/>
@@ -387,8 +413,6 @@
             <w:pPr>
               <w:spacing w:before="200"/>
             </w:pPr>
-            <w:bookmarkStart w:id="0" w:name="_GoBack"/>
-            <w:bookmarkEnd w:id="0"/>
           </w:p>
         </w:tc>
         <w:tc>
@@ -450,7 +474,7 @@
 </file>
 
 <file path=word/styles.xml><?xml version="1.0" encoding="utf-8"?>
-<w:styles xmlns:mc="http://schemas.openxmlformats.org/markup-compatibility/2006" xmlns:r="http://schemas.openxmlformats.org/officeDocument/2006/relationships" xmlns:w="http://schemas.openxmlformats.org/wordprocessingml/2006/main" xmlns:w14="http://schemas.microsoft.com/office/word/2010/wordml" xmlns:w15="http://schemas.microsoft.com/office/word/2012/wordml" xmlns:w16se="http://schemas.microsoft.com/office/word/2015/wordml/symex" mc:Ignorable="w14 w15 w16se">
+<w:styles xmlns:mc="http://schemas.openxmlformats.org/markup-compatibility/2006" xmlns:r="http://schemas.openxmlformats.org/officeDocument/2006/relationships" xmlns:w="http://schemas.openxmlformats.org/wordprocessingml/2006/main" xmlns:w14="http://schemas.microsoft.com/office/word/2010/wordml" xmlns:w15="http://schemas.microsoft.com/office/word/2012/wordml" xmlns:w16cid="http://schemas.microsoft.com/office/word/2016/wordml/cid" xmlns:w16se="http://schemas.microsoft.com/office/word/2015/wordml/symex" mc:Ignorable="w14 w15 w16se w16cid">
   <w:docDefaults>
     <w:rPrDefault>
       <w:rPr>
@@ -466,7 +490,7 @@
       </w:pPr>
     </w:pPrDefault>
   </w:docDefaults>
-  <w:latentStyles w:defLockedState="0" w:defUIPriority="99" w:defSemiHidden="0" w:defUnhideWhenUsed="0" w:defQFormat="0" w:count="374">
+  <w:latentStyles w:defLockedState="0" w:defUIPriority="99" w:defSemiHidden="0" w:defUnhideWhenUsed="0" w:defQFormat="0" w:count="375">
     <w:lsdException w:name="Normal" w:uiPriority="0" w:qFormat="1"/>
     <w:lsdException w:name="heading 1" w:uiPriority="9" w:qFormat="1"/>
     <w:lsdException w:name="heading 2" w:semiHidden="1" w:uiPriority="9" w:unhideWhenUsed="1" w:qFormat="1"/>
@@ -572,7 +596,6 @@
     <w:lsdException w:name="HTML Sample" w:semiHidden="1" w:unhideWhenUsed="1"/>
     <w:lsdException w:name="HTML Typewriter" w:semiHidden="1" w:unhideWhenUsed="1"/>
     <w:lsdException w:name="HTML Variable" w:semiHidden="1" w:unhideWhenUsed="1"/>
-    <w:lsdException w:name="Normal Table" w:semiHidden="1" w:unhideWhenUsed="1"/>
     <w:lsdException w:name="annotation subject" w:semiHidden="1" w:unhideWhenUsed="1"/>
     <w:lsdException w:name="No List" w:semiHidden="1" w:unhideWhenUsed="1"/>
     <w:lsdException w:name="Outline List 1" w:semiHidden="1" w:unhideWhenUsed="1"/>
@@ -619,10 +642,8 @@
     <w:lsdException w:name="Table Subtle 2" w:semiHidden="1" w:unhideWhenUsed="1"/>
     <w:lsdException w:name="Table Web 1" w:semiHidden="1" w:unhideWhenUsed="1"/>
     <w:lsdException w:name="Table Web 2" w:semiHidden="1" w:unhideWhenUsed="1"/>
-    <w:lsdException w:name="Table Web 3" w:semiHidden="1" w:unhideWhenUsed="1"/>
     <w:lsdException w:name="Balloon Text" w:semiHidden="1" w:unhideWhenUsed="1"/>
     <w:lsdException w:name="Table Grid" w:uiPriority="39"/>
-    <w:lsdException w:name="Table Theme" w:semiHidden="1" w:unhideWhenUsed="1"/>
     <w:lsdException w:name="Placeholder Text" w:semiHidden="1"/>
     <w:lsdException w:name="No Spacing" w:uiPriority="1" w:qFormat="1"/>
     <w:lsdException w:name="Light Shading" w:uiPriority="60"/>
@@ -841,6 +862,7 @@
     <w:lsdException w:name="Mention" w:semiHidden="1" w:unhideWhenUsed="1"/>
     <w:lsdException w:name="Smart Hyperlink" w:semiHidden="1" w:unhideWhenUsed="1"/>
     <w:lsdException w:name="Hashtag" w:semiHidden="1" w:unhideWhenUsed="1"/>
+    <w:lsdException w:name="Unresolved Mention" w:semiHidden="1" w:unhideWhenUsed="1"/>
   </w:latentStyles>
   <w:style w:type="paragraph" w:default="1" w:styleId="Normal">
     <w:name w:val="Normal"/>
@@ -1204,7 +1226,7 @@
 </file>
 
 <file path=customXml/itemProps1.xml><?xml version="1.0" encoding="utf-8"?>
-<ds:datastoreItem xmlns:ds="http://schemas.openxmlformats.org/officeDocument/2006/customXml" ds:itemID="{B5AF5009-B062-469B-86E2-5BA8A84B5F2E}">
+<ds:datastoreItem xmlns:ds="http://schemas.openxmlformats.org/officeDocument/2006/customXml" ds:itemID="{4C54E1C7-7CD8-4E8F-9666-1B47A939BCC7}">
   <ds:schemaRefs>
     <ds:schemaRef ds:uri="http://schemas.openxmlformats.org/officeDocument/2006/bibliography"/>
   </ds:schemaRefs>

</xml_diff>

<commit_message>
Checkpoint on DES updates
</commit_message>
<xml_diff>
--- a/CUWebinars.Web/App_Data/mergeTemplates/OrderSubmittedDES.docx
+++ b/CUWebinars.Web/App_Data/mergeTemplates/OrderSubmittedDES.docx
@@ -86,47 +86,7 @@
               <w:rPr>
                 <w:noProof/>
               </w:rPr>
-              <w:drawing>
-                <wp:inline distT="0" distB="0" distL="0" distR="0">
-                  <wp:extent cx="2400508" cy="762066"/>
-                  <wp:effectExtent l="0" t="0" r="0" b="0"/>
-                  <wp:docPr id="1" name="Picture 1"/>
-                  <wp:cNvGraphicFramePr>
-                    <a:graphicFrameLocks xmlns:a="http://schemas.openxmlformats.org/drawingml/2006/main" noChangeAspect="1"/>
-                  </wp:cNvGraphicFramePr>
-                  <a:graphic xmlns:a="http://schemas.openxmlformats.org/drawingml/2006/main">
-                    <a:graphicData uri="http://schemas.openxmlformats.org/drawingml/2006/picture">
-                      <pic:pic xmlns:pic="http://schemas.openxmlformats.org/drawingml/2006/picture">
-                        <pic:nvPicPr>
-                          <pic:cNvPr id="1" name="logo_bankwebinars.png"/>
-                          <pic:cNvPicPr/>
-                        </pic:nvPicPr>
-                        <pic:blipFill>
-                          <a:blip r:embed="rId5">
-                            <a:extLst>
-                              <a:ext uri="{28A0092B-C50C-407E-A947-70E740481C1C}">
-                                <a14:useLocalDpi xmlns:a14="http://schemas.microsoft.com/office/drawing/2010/main" val="0"/>
-                              </a:ext>
-                            </a:extLst>
-                          </a:blip>
-                          <a:stretch>
-                            <a:fillRect/>
-                          </a:stretch>
-                        </pic:blipFill>
-                        <pic:spPr>
-                          <a:xfrm>
-                            <a:off x="0" y="0"/>
-                            <a:ext cx="2400508" cy="762066"/>
-                          </a:xfrm>
-                          <a:prstGeom prst="rect">
-                            <a:avLst/>
-                          </a:prstGeom>
-                        </pic:spPr>
-                      </pic:pic>
-                    </a:graphicData>
-                  </a:graphic>
-                </wp:inline>
-              </w:drawing>
+              <w:t>[logo]</w:t>
             </w:r>
             <w:r>
               <w:rPr>
@@ -196,7 +156,15 @@
                       <w:sz w:val="18"/>
                       <w:szCs w:val="18"/>
                     </w:rPr>
-                    <w:t>Order ID:</w:t>
+                    <w:t>Email</w:t>
+                  </w:r>
+                  <w:r>
+                    <w:rPr>
+                      <w:color w:val="7F7F7F" w:themeColor="text1" w:themeTint="80"/>
+                      <w:sz w:val="18"/>
+                      <w:szCs w:val="18"/>
+                    </w:rPr>
+                    <w:t>:</w:t>
                   </w:r>
                 </w:p>
               </w:tc>
@@ -214,38 +182,23 @@
                     </w:rPr>
                   </w:pPr>
                   <w:r>
-                    <w:rPr>
-                      <w:sz w:val="18"/>
-                      <w:szCs w:val="18"/>
-                    </w:rPr>
                     <w:fldChar w:fldCharType="begin"/>
                   </w:r>
                   <w:r>
-                    <w:rPr>
-                      <w:sz w:val="18"/>
-                      <w:szCs w:val="18"/>
-                    </w:rPr>
-                    <w:instrText xml:space="preserve"> MERGEFIELD  OrderID  \* MERGEFORMAT </w:instrText>
+                    <w:instrText xml:space="preserve"> MERGEFIELD  BillingEmail  \* MERGEFORMAT </w:instrText>
                   </w:r>
                   <w:r>
-                    <w:rPr>
-                      <w:sz w:val="18"/>
-                      <w:szCs w:val="18"/>
-                    </w:rPr>
                     <w:fldChar w:fldCharType="separate"/>
                   </w:r>
                   <w:r>
                     <w:rPr>
                       <w:noProof/>
-                      <w:sz w:val="18"/>
-                      <w:szCs w:val="18"/>
                     </w:rPr>
-                    <w:t>«OrderID»</w:t>
+                    <w:t>«BillingEmail»</w:t>
                   </w:r>
                   <w:r>
                     <w:rPr>
-                      <w:sz w:val="18"/>
-                      <w:szCs w:val="18"/>
+                      <w:noProof/>
                     </w:rPr>
                     <w:fldChar w:fldCharType="end"/>
                   </w:r>
@@ -261,6 +214,8 @@
                 <w:szCs w:val="18"/>
               </w:rPr>
             </w:pPr>
+            <w:bookmarkStart w:id="0" w:name="_GoBack"/>
+            <w:bookmarkEnd w:id="0"/>
           </w:p>
         </w:tc>
         <w:tc>
@@ -345,14 +300,6 @@
             </w:fldSimple>
             <w:r>
               <w:t>,</w:t>
-            </w:r>
-          </w:p>
-          <w:p>
-            <w:pPr>
-              <w:spacing w:before="200"/>
-            </w:pPr>
-            <w:r>
-              <w:t>Hello,</w:t>
             </w:r>
           </w:p>
           <w:p>
@@ -378,21 +325,6 @@
                 <w:t>«RegDesc»</w:t>
               </w:r>
             </w:fldSimple>
-            <w:bookmarkStart w:id="0" w:name="_GoBack"/>
-            <w:bookmarkEnd w:id="0"/>
-          </w:p>
-          <w:p>
-            <w:pPr>
-              <w:spacing w:before="200"/>
-            </w:pPr>
-            <w:r>
-              <w:t>A Directors Education Series representative will contact you shortly with your account and group information. </w:t>
-            </w:r>
-          </w:p>
-          <w:p>
-            <w:pPr>
-              <w:spacing w:before="200"/>
-            </w:pPr>
           </w:p>
           <w:p>
             <w:pPr>
@@ -403,7 +335,17 @@
               </w:rPr>
             </w:pPr>
             <w:r>
-              <w:t>If you have any questions or do not hear from a representative, please email info@ttsTrain.com or call 800-831-0678.</w:t>
+              <w:rPr>
+                <w:rFonts w:ascii="Calibri" w:hAnsi="Calibri"/>
+                <w:color w:val="000000"/>
+              </w:rPr>
+              <w:t xml:space="preserve">A Directors Education Series representative will contact you shortly with your account information. </w:t>
+            </w:r>
+            <w:r>
+              <w:t xml:space="preserve">If you have any questions, </w:t>
+            </w:r>
+            <w:r>
+              <w:t>please email info@ttsTrain.com or call 800-831-0678.</w:t>
             </w:r>
             <w:r>
               <w:br/>
@@ -596,6 +538,7 @@
     <w:lsdException w:name="HTML Sample" w:semiHidden="1" w:unhideWhenUsed="1"/>
     <w:lsdException w:name="HTML Typewriter" w:semiHidden="1" w:unhideWhenUsed="1"/>
     <w:lsdException w:name="HTML Variable" w:semiHidden="1" w:unhideWhenUsed="1"/>
+    <w:lsdException w:name="Normal Table" w:semiHidden="1" w:unhideWhenUsed="1"/>
     <w:lsdException w:name="annotation subject" w:semiHidden="1" w:unhideWhenUsed="1"/>
     <w:lsdException w:name="No List" w:semiHidden="1" w:unhideWhenUsed="1"/>
     <w:lsdException w:name="Outline List 1" w:semiHidden="1" w:unhideWhenUsed="1"/>
@@ -642,8 +585,10 @@
     <w:lsdException w:name="Table Subtle 2" w:semiHidden="1" w:unhideWhenUsed="1"/>
     <w:lsdException w:name="Table Web 1" w:semiHidden="1" w:unhideWhenUsed="1"/>
     <w:lsdException w:name="Table Web 2" w:semiHidden="1" w:unhideWhenUsed="1"/>
+    <w:lsdException w:name="Table Web 3" w:semiHidden="1" w:unhideWhenUsed="1"/>
     <w:lsdException w:name="Balloon Text" w:semiHidden="1" w:unhideWhenUsed="1"/>
     <w:lsdException w:name="Table Grid" w:uiPriority="39"/>
+    <w:lsdException w:name="Table Theme" w:semiHidden="1" w:unhideWhenUsed="1"/>
     <w:lsdException w:name="Placeholder Text" w:semiHidden="1"/>
     <w:lsdException w:name="No Spacing" w:uiPriority="1" w:qFormat="1"/>
     <w:lsdException w:name="Light Shading" w:uiPriority="60"/>
@@ -1226,7 +1171,7 @@
 </file>
 
 <file path=customXml/itemProps1.xml><?xml version="1.0" encoding="utf-8"?>
-<ds:datastoreItem xmlns:ds="http://schemas.openxmlformats.org/officeDocument/2006/customXml" ds:itemID="{4C54E1C7-7CD8-4E8F-9666-1B47A939BCC7}">
+<ds:datastoreItem xmlns:ds="http://schemas.openxmlformats.org/officeDocument/2006/customXml" ds:itemID="{C4F94938-C6B8-441A-9C52-291F565265CA}">
   <ds:schemaRefs>
     <ds:schemaRef ds:uri="http://schemas.openxmlformats.org/officeDocument/2006/bibliography"/>
   </ds:schemaRefs>

</xml_diff>

<commit_message>
Adds email to Presenter model Final touches to DES
</commit_message>
<xml_diff>
--- a/CUWebinars.Web/App_Data/mergeTemplates/OrderSubmittedDES.docx
+++ b/CUWebinars.Web/App_Data/mergeTemplates/OrderSubmittedDES.docx
@@ -181,27 +181,14 @@
                       <w:szCs w:val="18"/>
                     </w:rPr>
                   </w:pPr>
-                  <w:r>
-                    <w:fldChar w:fldCharType="begin"/>
-                  </w:r>
-                  <w:r>
-                    <w:instrText xml:space="preserve"> MERGEFIELD  BillingEmail  \* MERGEFORMAT </w:instrText>
-                  </w:r>
-                  <w:r>
-                    <w:fldChar w:fldCharType="separate"/>
-                  </w:r>
-                  <w:r>
-                    <w:rPr>
-                      <w:noProof/>
-                    </w:rPr>
-                    <w:t>«BillingEmail»</w:t>
-                  </w:r>
-                  <w:r>
-                    <w:rPr>
-                      <w:noProof/>
-                    </w:rPr>
-                    <w:fldChar w:fldCharType="end"/>
-                  </w:r>
+                  <w:fldSimple w:instr=" MERGEFIELD  BillingEmail  \* MERGEFORMAT ">
+                    <w:r>
+                      <w:rPr>
+                        <w:noProof/>
+                      </w:rPr>
+                      <w:t>«BillingEmail»</w:t>
+                    </w:r>
+                  </w:fldSimple>
                 </w:p>
               </w:tc>
             </w:tr>
@@ -214,8 +201,6 @@
                 <w:szCs w:val="18"/>
               </w:rPr>
             </w:pPr>
-            <w:bookmarkStart w:id="0" w:name="_GoBack"/>
-            <w:bookmarkEnd w:id="0"/>
           </w:p>
         </w:tc>
         <w:tc>
@@ -290,14 +275,27 @@
             <w:r>
               <w:t xml:space="preserve">Dear </w:t>
             </w:r>
-            <w:fldSimple w:instr=" MERGEFIELD  FirstName  \* MERGEFORMAT ">
-              <w:r>
-                <w:rPr>
-                  <w:noProof/>
-                </w:rPr>
-                <w:t>«FirstName»</w:t>
-              </w:r>
-            </w:fldSimple>
+            <w:r>
+              <w:fldChar w:fldCharType="begin"/>
+            </w:r>
+            <w:r>
+              <w:instrText xml:space="preserve"> MERGEFIELD  FirstName  \* MERGEFORMAT </w:instrText>
+            </w:r>
+            <w:r>
+              <w:fldChar w:fldCharType="separate"/>
+            </w:r>
+            <w:r>
+              <w:rPr>
+                <w:noProof/>
+              </w:rPr>
+              <w:t>«FirstName»</w:t>
+            </w:r>
+            <w:r>
+              <w:rPr>
+                <w:noProof/>
+              </w:rPr>
+              <w:fldChar w:fldCharType="end"/>
+            </w:r>
             <w:r>
               <w:t>,</w:t>
             </w:r>
@@ -317,14 +315,27 @@
                 <w:noProof/>
               </w:rPr>
             </w:pPr>
-            <w:fldSimple w:instr=" MERGEFIELD  RegDesc  \* MERGEFORMAT ">
-              <w:r>
-                <w:rPr>
-                  <w:noProof/>
-                </w:rPr>
-                <w:t>«RegDesc»</w:t>
-              </w:r>
-            </w:fldSimple>
+            <w:r>
+              <w:fldChar w:fldCharType="begin"/>
+            </w:r>
+            <w:r>
+              <w:instrText xml:space="preserve"> MERGEFIELD  RegDesc  \* MERGEFORMAT </w:instrText>
+            </w:r>
+            <w:r>
+              <w:fldChar w:fldCharType="separate"/>
+            </w:r>
+            <w:r>
+              <w:rPr>
+                <w:noProof/>
+              </w:rPr>
+              <w:t>«RegDesc»</w:t>
+            </w:r>
+            <w:r>
+              <w:rPr>
+                <w:noProof/>
+              </w:rPr>
+              <w:fldChar w:fldCharType="end"/>
+            </w:r>
           </w:p>
           <w:p>
             <w:pPr>
@@ -342,11 +353,26 @@
               <w:t xml:space="preserve">A Directors Education Series representative will contact you shortly with your account information. </w:t>
             </w:r>
             <w:r>
-              <w:t xml:space="preserve">If you have any questions, </w:t>
-            </w:r>
-            <w:r>
-              <w:t>please email info@ttsTrain.com or call 800-831-0678.</w:t>
-            </w:r>
+              <w:rPr>
+                <w:rFonts w:ascii="Calibri" w:hAnsi="Calibri"/>
+              </w:rPr>
+              <w:t xml:space="preserve">If you do not see our message in a timely fashion (and after checking your spam folder for a message from DirectorSeries@ttsregistrations.com) please contact Customer Service </w:t>
+            </w:r>
+            <w:r>
+              <w:rPr>
+                <w:rFonts w:ascii="Calibri" w:hAnsi="Calibri"/>
+                <w:color w:val="FF0000"/>
+              </w:rPr>
+              <w:t>at info@ttstrain.com</w:t>
+            </w:r>
+            <w:r>
+              <w:rPr>
+                <w:rFonts w:ascii="Calibri" w:hAnsi="Calibri"/>
+              </w:rPr>
+              <w:t>.</w:t>
+            </w:r>
+            <w:bookmarkStart w:id="0" w:name="_GoBack"/>
+            <w:bookmarkEnd w:id="0"/>
             <w:r>
               <w:br/>
             </w:r>
@@ -1171,7 +1197,7 @@
 </file>
 
 <file path=customXml/itemProps1.xml><?xml version="1.0" encoding="utf-8"?>
-<ds:datastoreItem xmlns:ds="http://schemas.openxmlformats.org/officeDocument/2006/customXml" ds:itemID="{C4F94938-C6B8-441A-9C52-291F565265CA}">
+<ds:datastoreItem xmlns:ds="http://schemas.openxmlformats.org/officeDocument/2006/customXml" ds:itemID="{9B2E997E-DEFB-493B-A230-826B07411DA7}">
   <ds:schemaRefs>
     <ds:schemaRef ds:uri="http://schemas.openxmlformats.org/officeDocument/2006/bibliography"/>
   </ds:schemaRefs>

</xml_diff>

<commit_message>
Commit inital implementation of RemoveDiscount
</commit_message>
<xml_diff>
--- a/CUWebinars.Web/App_Data/mergeTemplates/OrderSubmittedDES.docx
+++ b/CUWebinars.Web/App_Data/mergeTemplates/OrderSubmittedDES.docx
@@ -181,14 +181,27 @@
                       <w:szCs w:val="18"/>
                     </w:rPr>
                   </w:pPr>
-                  <w:fldSimple w:instr=" MERGEFIELD  BillingEmail  \* MERGEFORMAT ">
-                    <w:r>
-                      <w:rPr>
-                        <w:noProof/>
-                      </w:rPr>
-                      <w:t>«BillingEmail»</w:t>
-                    </w:r>
-                  </w:fldSimple>
+                  <w:r>
+                    <w:fldChar w:fldCharType="begin"/>
+                  </w:r>
+                  <w:r>
+                    <w:instrText xml:space="preserve"> MERGEFIELD  BillingEmail  \* MERGEFORMAT </w:instrText>
+                  </w:r>
+                  <w:r>
+                    <w:fldChar w:fldCharType="separate"/>
+                  </w:r>
+                  <w:r>
+                    <w:rPr>
+                      <w:noProof/>
+                    </w:rPr>
+                    <w:t>«BillingEmail»</w:t>
+                  </w:r>
+                  <w:r>
+                    <w:rPr>
+                      <w:noProof/>
+                    </w:rPr>
+                    <w:fldChar w:fldCharType="end"/>
+                  </w:r>
                 </w:p>
               </w:tc>
             </w:tr>
@@ -275,27 +288,14 @@
             <w:r>
               <w:t xml:space="preserve">Dear </w:t>
             </w:r>
-            <w:r>
-              <w:fldChar w:fldCharType="begin"/>
-            </w:r>
-            <w:r>
-              <w:instrText xml:space="preserve"> MERGEFIELD  FirstName  \* MERGEFORMAT </w:instrText>
-            </w:r>
-            <w:r>
-              <w:fldChar w:fldCharType="separate"/>
-            </w:r>
-            <w:r>
-              <w:rPr>
-                <w:noProof/>
-              </w:rPr>
-              <w:t>«FirstName»</w:t>
-            </w:r>
-            <w:r>
-              <w:rPr>
-                <w:noProof/>
-              </w:rPr>
-              <w:fldChar w:fldCharType="end"/>
-            </w:r>
+            <w:fldSimple w:instr=" MERGEFIELD  FirstName  \* MERGEFORMAT ">
+              <w:r>
+                <w:rPr>
+                  <w:noProof/>
+                </w:rPr>
+                <w:t>«FirstName»</w:t>
+              </w:r>
+            </w:fldSimple>
             <w:r>
               <w:t>,</w:t>
             </w:r>
@@ -315,27 +315,14 @@
                 <w:noProof/>
               </w:rPr>
             </w:pPr>
-            <w:r>
-              <w:fldChar w:fldCharType="begin"/>
-            </w:r>
-            <w:r>
-              <w:instrText xml:space="preserve"> MERGEFIELD  RegDesc  \* MERGEFORMAT </w:instrText>
-            </w:r>
-            <w:r>
-              <w:fldChar w:fldCharType="separate"/>
-            </w:r>
-            <w:r>
-              <w:rPr>
-                <w:noProof/>
-              </w:rPr>
-              <w:t>«RegDesc»</w:t>
-            </w:r>
-            <w:r>
-              <w:rPr>
-                <w:noProof/>
-              </w:rPr>
-              <w:fldChar w:fldCharType="end"/>
-            </w:r>
+            <w:fldSimple w:instr=" MERGEFIELD  RegDesc  \* MERGEFORMAT ">
+              <w:r>
+                <w:rPr>
+                  <w:noProof/>
+                </w:rPr>
+                <w:t>«RegDesc»</w:t>
+              </w:r>
+            </w:fldSimple>
           </w:p>
           <w:p>
             <w:pPr>
@@ -346,33 +333,30 @@
               </w:rPr>
             </w:pPr>
             <w:r>
-              <w:rPr>
-                <w:rFonts w:ascii="Calibri" w:hAnsi="Calibri"/>
-                <w:color w:val="000000"/>
-              </w:rPr>
-              <w:t xml:space="preserve">A Directors Education Series representative will contact you shortly with your account information. </w:t>
+              <w:t>A Directors Education Series representative will contact you shortly with your account information. If you do not see our message in a timely fashion (and after checking your spam folder) please contact our Customer Service at</w:t>
             </w:r>
             <w:r>
               <w:rPr>
-                <w:rFonts w:ascii="Calibri" w:hAnsi="Calibri"/>
-              </w:rPr>
-              <w:t xml:space="preserve">If you do not see our message in a timely fashion (and after checking your spam folder for a message from DirectorSeries@ttsregistrations.com) please contact Customer Service </w:t>
-            </w:r>
-            <w:r>
-              <w:rPr>
-                <w:rFonts w:ascii="Calibri" w:hAnsi="Calibri"/>
                 <w:color w:val="FF0000"/>
               </w:rPr>
-              <w:t>at info@ttstrain.com</w:t>
+              <w:t xml:space="preserve"> </w:t>
             </w:r>
+            <w:hyperlink r:id="rId5" w:history="1">
+              <w:r>
+                <w:rPr>
+                  <w:rStyle w:val="Hyperlink"/>
+                </w:rPr>
+                <w:t>info@ttstrain.com</w:t>
+              </w:r>
+            </w:hyperlink>
+            <w:bookmarkStart w:id="0" w:name="_GoBack"/>
+            <w:bookmarkEnd w:id="0"/>
             <w:r>
               <w:rPr>
                 <w:rFonts w:ascii="Calibri" w:hAnsi="Calibri"/>
               </w:rPr>
               <w:t>.</w:t>
             </w:r>
-            <w:bookmarkStart w:id="0" w:name="_GoBack"/>
-            <w:bookmarkEnd w:id="0"/>
             <w:r>
               <w:br/>
             </w:r>
@@ -1197,7 +1181,7 @@
 </file>
 
 <file path=customXml/itemProps1.xml><?xml version="1.0" encoding="utf-8"?>
-<ds:datastoreItem xmlns:ds="http://schemas.openxmlformats.org/officeDocument/2006/customXml" ds:itemID="{9B2E997E-DEFB-493B-A230-826B07411DA7}">
+<ds:datastoreItem xmlns:ds="http://schemas.openxmlformats.org/officeDocument/2006/customXml" ds:itemID="{294AD449-DBA3-494C-A27C-BDB4361E81EC}">
   <ds:schemaRefs>
     <ds:schemaRef ds:uri="http://schemas.openxmlformats.org/officeDocument/2006/bibliography"/>
   </ds:schemaRefs>

</xml_diff>